<commit_message>
sync: Actualización de contenidos de forma.
</commit_message>
<xml_diff>
--- a/7. FORMULARIO_CARACTERIZACIÓN_FORMULACIÓN_PROBLEMAS.docx
+++ b/7. FORMULARIO_CARACTERIZACIÓN_FORMULACIÓN_PROBLEMAS.docx
@@ -1462,18 +1462,8 @@
           <w:b/>
           <w:bCs/>
         </w:rPr>
-        <w:t xml:space="preserve">Variables </w:t>
+        <w:t>Variables clave identificadas</w:t>
       </w:r>
-      <w:proofErr w:type="gramStart"/>
-      <w:r>
-        <w:rPr>
-          <w:rFonts w:ascii="Liberation Sans" w:eastAsia="Liberation Sans" w:hAnsi="Liberation Sans" w:cs="Liberation Sans"/>
-          <w:b/>
-          <w:bCs/>
-        </w:rPr>
-        <w:t>clave identificadas</w:t>
-      </w:r>
-      <w:proofErr w:type="gramEnd"/>
       <w:r>
         <w:rPr>
           <w:rFonts w:ascii="Liberation Sans" w:eastAsia="Liberation Sans" w:hAnsi="Liberation Sans" w:cs="Liberation Sans"/>
@@ -1564,15 +1554,7 @@
               <w:b/>
               <w:bCs/>
             </w:rPr>
-            <w:t xml:space="preserve"> desde el </w:t>
-          </w:r>
-          <w:r>
-            <w:rPr>
-              <w:rFonts w:ascii="Liberation Sans" w:eastAsia="Liberation Sans" w:hAnsi="Liberation Sans" w:cs="Liberation Sans"/>
-              <w:b/>
-              <w:bCs/>
-            </w:rPr>
-            <w:t>domicilio del estudiante hasta la universidad.</w:t>
+            <w:t xml:space="preserve"> desde el domicilio del estudiante hasta la universidad.</w:t>
           </w:r>
           <w:r>
             <w:rPr>
@@ -2086,7 +2068,7 @@
           </w:rPr>
           <w:id w:val="-1620455706"/>
           <w14:checkbox>
-            <w14:checked w14:val="0"/>
+            <w14:checked w14:val="1"/>
             <w14:checkedState w14:val="2612" w14:font="MS Gothic"/>
             <w14:uncheckedState w14:val="2610" w14:font="MS Gothic"/>
           </w14:checkbox>
@@ -2096,7 +2078,7 @@
             <w:rPr>
               <w:rFonts w:ascii="MS Gothic" w:eastAsia="MS Gothic" w:hAnsi="MS Gothic" w:cs="Liberation Sans" w:hint="eastAsia"/>
             </w:rPr>
-            <w:t>☐</w:t>
+            <w:t>☒</w:t>
           </w:r>
         </w:sdtContent>
       </w:sdt>
@@ -2121,7 +2103,7 @@
           </w:rPr>
           <w:id w:val="693813301"/>
           <w14:checkbox>
-            <w14:checked w14:val="1"/>
+            <w14:checked w14:val="0"/>
             <w14:checkedState w14:val="2612" w14:font="MS Gothic"/>
             <w14:uncheckedState w14:val="2610" w14:font="MS Gothic"/>
           </w14:checkbox>
@@ -2131,7 +2113,7 @@
             <w:rPr>
               <w:rFonts w:ascii="MS Gothic" w:eastAsia="MS Gothic" w:hAnsi="MS Gothic" w:cs="Liberation Sans" w:hint="eastAsia"/>
             </w:rPr>
-            <w:t>☒</w:t>
+            <w:t>☐</w:t>
           </w:r>
         </w:sdtContent>
       </w:sdt>
@@ -2190,8 +2172,12 @@
         <w:placeholder>
           <w:docPart w:val="3A394460C07C421E8AA8A6D0AA903764"/>
         </w:placeholder>
-        <w:showingPlcHdr/>
       </w:sdtPr>
+      <w:sdtEndPr>
+        <w:rPr>
+          <w:rFonts w:ascii="Calibri" w:eastAsia="Calibri" w:hAnsi="Calibri" w:cs="Calibri"/>
+        </w:rPr>
+      </w:sdtEndPr>
       <w:sdtContent>
         <w:p>
           <w:pPr>
@@ -2204,14 +2190,35 @@
             <w:rPr>
               <w:rFonts w:ascii="Liberation Sans" w:eastAsia="Liberation Sans" w:hAnsi="Liberation Sans" w:cs="Liberation Sans"/>
             </w:rPr>
-            <w:t>En caso afirmativo, describa brevemente cómo se incorporan estos enfoques en el análisis</w:t>
-          </w:r>
-          <w:r>
-            <w:rPr>
-              <w:rStyle w:val="Textodelmarcadordeposicin"/>
-              <w:lang w:eastAsia="es-CO"/>
-            </w:rPr>
-            <w:t>.</w:t>
+            <w:t>Se incorpora avance y abandono académico por UPL.</w:t>
+          </w:r>
+        </w:p>
+        <w:p>
+          <w:pPr>
+            <w:ind w:left="708"/>
+            <w:rPr>
+              <w:rFonts w:ascii="Liberation Sans" w:eastAsia="Liberation Sans" w:hAnsi="Liberation Sans" w:cs="Liberation Sans"/>
+            </w:rPr>
+          </w:pPr>
+          <w:r>
+            <w:rPr>
+              <w:rFonts w:ascii="Liberation Sans" w:eastAsia="Liberation Sans" w:hAnsi="Liberation Sans" w:cs="Liberation Sans"/>
+            </w:rPr>
+            <w:t xml:space="preserve">Se compara la población dentro y fuera del SISBEN para determinar la intensidad del efecto del acceso territorial sobre el desempeño </w:t>
+          </w:r>
+          <w:proofErr w:type="spellStart"/>
+          <w:r>
+            <w:rPr>
+              <w:rFonts w:ascii="Liberation Sans" w:eastAsia="Liberation Sans" w:hAnsi="Liberation Sans" w:cs="Liberation Sans"/>
+            </w:rPr>
+            <w:t>académcio</w:t>
+          </w:r>
+          <w:proofErr w:type="spellEnd"/>
+          <w:r>
+            <w:rPr>
+              <w:rFonts w:ascii="Liberation Sans" w:eastAsia="Liberation Sans" w:hAnsi="Liberation Sans" w:cs="Liberation Sans"/>
+            </w:rPr>
+            <w:t xml:space="preserve">. </w:t>
           </w:r>
         </w:p>
       </w:sdtContent>
@@ -2806,7 +2813,7 @@
           </w:rPr>
           <w:id w:val="271986149"/>
           <w14:checkbox>
-            <w14:checked w14:val="0"/>
+            <w14:checked w14:val="1"/>
             <w14:checkedState w14:val="2612" w14:font="MS Gothic"/>
             <w14:uncheckedState w14:val="2610" w14:font="MS Gothic"/>
           </w14:checkbox>
@@ -2818,7 +2825,7 @@
               <w:b/>
               <w:bCs/>
             </w:rPr>
-            <w:t>☐</w:t>
+            <w:t>☒</w:t>
           </w:r>
         </w:sdtContent>
       </w:sdt>
@@ -2842,6 +2849,7 @@
           <w:b/>
           <w:bCs/>
         </w:rPr>
+        <w:lastRenderedPageBreak/>
         <w:t xml:space="preserve">Visualización de datos </w:t>
       </w:r>
       <w:sdt>
@@ -2936,7 +2944,6 @@
           <w:b/>
           <w:bCs/>
         </w:rPr>
-        <w:lastRenderedPageBreak/>
         <w:t>Análisis geoespacial</w:t>
       </w:r>
       <w:r>
@@ -3582,6 +3589,7 @@
           <w:sz w:val="20"/>
           <w:szCs w:val="20"/>
         </w:rPr>
+        <w:lastRenderedPageBreak/>
         <w:t xml:space="preserve">Sección </w:t>
       </w:r>
       <w:r>
@@ -7853,6 +7861,7 @@
   <w:style w:type="character" w:default="1" w:styleId="Fuentedeprrafopredeter">
     <w:name w:val="Default Paragraph Font"/>
     <w:uiPriority w:val="1"/>
+    <w:semiHidden/>
     <w:unhideWhenUsed/>
   </w:style>
   <w:style w:type="table" w:default="1" w:styleId="Tablanormal">
@@ -9811,9 +9820,11 @@
     <w:rsid w:val="000011C6"/>
     <w:rsid w:val="00017FC6"/>
     <w:rsid w:val="000D0051"/>
+    <w:rsid w:val="001C6C25"/>
     <w:rsid w:val="00512DF4"/>
     <w:rsid w:val="005805C8"/>
     <w:rsid w:val="005A0D10"/>
+    <w:rsid w:val="006F38E9"/>
     <w:rsid w:val="008A3700"/>
     <w:rsid w:val="008B30CA"/>
     <w:rsid w:val="00935E08"/>
@@ -11530,6 +11541,10 @@
 </file>
 
 <file path=customXml/item1.xml><?xml version="1.0" encoding="utf-8"?>
+<b:Sources xmlns:b="http://schemas.openxmlformats.org/officeDocument/2006/bibliography" xmlns="http://schemas.openxmlformats.org/officeDocument/2006/bibliography" SelectedStyle="\APASixthEditionOfficeOnline.xsl" StyleName="APA" Version="6"/>
+</file>
+
+<file path=customXml/item2.xml><?xml version="1.0" encoding="utf-8"?>
 <?mso-contentType ?>
 <FormTemplates xmlns="http://schemas.microsoft.com/sharepoint/v3/contenttype/forms">
   <Display>DocumentLibraryForm</Display>
@@ -11538,24 +11553,7 @@
 </FormTemplates>
 </file>
 
-<file path=customXml/item2.xml><?xml version="1.0" encoding="utf-8"?>
-<b:Sources xmlns:b="http://schemas.openxmlformats.org/officeDocument/2006/bibliography" xmlns="http://schemas.openxmlformats.org/officeDocument/2006/bibliography" SelectedStyle="\APASixthEditionOfficeOnline.xsl" StyleName="APA" Version="6"/>
-</file>
-
 <file path=customXml/item3.xml><?xml version="1.0" encoding="utf-8"?>
-<p:properties xmlns:p="http://schemas.microsoft.com/office/2006/metadata/properties" xmlns:xsi="http://www.w3.org/2001/XMLSchema-instance" xmlns:pc="http://schemas.microsoft.com/office/infopath/2007/PartnerControls">
-  <documentManagement>
-    <_ip_UnifiedCompliancePolicyUIAction xmlns="http://schemas.microsoft.com/sharepoint/v3" xsi:nil="true"/>
-    <TaxCatchAll xmlns="7755e09e-18d1-493a-950e-5a615bcdbc52" xsi:nil="true"/>
-    <_ip_UnifiedCompliancePolicyProperties xmlns="http://schemas.microsoft.com/sharepoint/v3" xsi:nil="true"/>
-    <lcf76f155ced4ddcb4097134ff3c332f xmlns="9c3aca8e-802d-4afe-8de2-403351c573ee">
-      <Terms xmlns="http://schemas.microsoft.com/office/infopath/2007/PartnerControls"/>
-    </lcf76f155ced4ddcb4097134ff3c332f>
-  </documentManagement>
-</p:properties>
-</file>
-
-<file path=customXml/item4.xml><?xml version="1.0" encoding="utf-8"?>
 <ct:contentTypeSchema xmlns:ct="http://schemas.microsoft.com/office/2006/metadata/contentType" xmlns:ma="http://schemas.microsoft.com/office/2006/metadata/properties/metaAttributes" ct:_="" ma:_="" ma:contentTypeName="Documento" ma:contentTypeID="0x010100E35D5CFF27142147BAF1F3476208DFD8" ma:contentTypeVersion="21" ma:contentTypeDescription="Crear nuevo documento." ma:contentTypeScope="" ma:versionID="bf36b99a6e9cb6c4c04e69905c56a055">
   <xsd:schema xmlns:xsd="http://www.w3.org/2001/XMLSchema" xmlns:xs="http://www.w3.org/2001/XMLSchema" xmlns:p="http://schemas.microsoft.com/office/2006/metadata/properties" xmlns:ns1="http://schemas.microsoft.com/sharepoint/v3" xmlns:ns2="9c3aca8e-802d-4afe-8de2-403351c573ee" xmlns:ns3="7755e09e-18d1-493a-950e-5a615bcdbc52" targetNamespace="http://schemas.microsoft.com/office/2006/metadata/properties" ma:root="true" ma:fieldsID="0aadd8d177eb5bb2c3d9d64c2b0f37ab" ns1:_="" ns2:_="" ns3:_="">
     <xsd:import namespace="http://schemas.microsoft.com/sharepoint/v3"/>
@@ -11833,7 +11831,28 @@
 </ct:contentTypeSchema>
 </file>
 
+<file path=customXml/item4.xml><?xml version="1.0" encoding="utf-8"?>
+<p:properties xmlns:p="http://schemas.microsoft.com/office/2006/metadata/properties" xmlns:xsi="http://www.w3.org/2001/XMLSchema-instance" xmlns:pc="http://schemas.microsoft.com/office/infopath/2007/PartnerControls">
+  <documentManagement>
+    <_ip_UnifiedCompliancePolicyUIAction xmlns="http://schemas.microsoft.com/sharepoint/v3" xsi:nil="true"/>
+    <TaxCatchAll xmlns="7755e09e-18d1-493a-950e-5a615bcdbc52" xsi:nil="true"/>
+    <_ip_UnifiedCompliancePolicyProperties xmlns="http://schemas.microsoft.com/sharepoint/v3" xsi:nil="true"/>
+    <lcf76f155ced4ddcb4097134ff3c332f xmlns="9c3aca8e-802d-4afe-8de2-403351c573ee">
+      <Terms xmlns="http://schemas.microsoft.com/office/infopath/2007/PartnerControls"/>
+    </lcf76f155ced4ddcb4097134ff3c332f>
+  </documentManagement>
+</p:properties>
+</file>
+
 <file path=customXml/itemProps1.xml><?xml version="1.0" encoding="utf-8"?>
+<ds:datastoreItem xmlns:ds="http://schemas.openxmlformats.org/officeDocument/2006/customXml" ds:itemID="{1C7E8C72-8D6F-40D6-BD69-93E029065D11}">
+  <ds:schemaRefs>
+    <ds:schemaRef ds:uri="http://schemas.openxmlformats.org/officeDocument/2006/bibliography"/>
+  </ds:schemaRefs>
+</ds:datastoreItem>
+</file>
+
+<file path=customXml/itemProps2.xml><?xml version="1.0" encoding="utf-8"?>
 <ds:datastoreItem xmlns:ds="http://schemas.openxmlformats.org/officeDocument/2006/customXml" ds:itemID="{9B6DFC92-80A5-46F4-B508-CDB322A80F3D}">
   <ds:schemaRefs>
     <ds:schemaRef ds:uri="http://schemas.microsoft.com/sharepoint/v3/contenttype/forms"/>
@@ -11841,27 +11860,7 @@
 </ds:datastoreItem>
 </file>
 
-<file path=customXml/itemProps2.xml><?xml version="1.0" encoding="utf-8"?>
-<ds:datastoreItem xmlns:ds="http://schemas.openxmlformats.org/officeDocument/2006/customXml" ds:itemID="{1C7E8C72-8D6F-40D6-BD69-93E029065D11}">
-  <ds:schemaRefs>
-    <ds:schemaRef ds:uri="http://schemas.openxmlformats.org/officeDocument/2006/bibliography"/>
-  </ds:schemaRefs>
-</ds:datastoreItem>
-</file>
-
 <file path=customXml/itemProps3.xml><?xml version="1.0" encoding="utf-8"?>
-<ds:datastoreItem xmlns:ds="http://schemas.openxmlformats.org/officeDocument/2006/customXml" ds:itemID="{AF9B5B2A-8912-4DAC-8206-0DA01C3E19AE}">
-  <ds:schemaRefs>
-    <ds:schemaRef ds:uri="http://schemas.microsoft.com/office/2006/metadata/properties"/>
-    <ds:schemaRef ds:uri="http://schemas.microsoft.com/office/infopath/2007/PartnerControls"/>
-    <ds:schemaRef ds:uri="http://schemas.microsoft.com/sharepoint/v3"/>
-    <ds:schemaRef ds:uri="7755e09e-18d1-493a-950e-5a615bcdbc52"/>
-    <ds:schemaRef ds:uri="9c3aca8e-802d-4afe-8de2-403351c573ee"/>
-  </ds:schemaRefs>
-</ds:datastoreItem>
-</file>
-
-<file path=customXml/itemProps4.xml><?xml version="1.0" encoding="utf-8"?>
 <ds:datastoreItem xmlns:ds="http://schemas.openxmlformats.org/officeDocument/2006/customXml" ds:itemID="{F8843571-F4F1-4580-ABF9-E707A58658F7}">
   <ds:schemaRefs>
     <ds:schemaRef ds:uri="http://schemas.microsoft.com/office/2006/metadata/contentType"/>
@@ -11881,6 +11880,18 @@
 </ds:datastoreItem>
 </file>
 
+<file path=customXml/itemProps4.xml><?xml version="1.0" encoding="utf-8"?>
+<ds:datastoreItem xmlns:ds="http://schemas.openxmlformats.org/officeDocument/2006/customXml" ds:itemID="{AF9B5B2A-8912-4DAC-8206-0DA01C3E19AE}">
+  <ds:schemaRefs>
+    <ds:schemaRef ds:uri="http://schemas.microsoft.com/office/2006/metadata/properties"/>
+    <ds:schemaRef ds:uri="http://schemas.microsoft.com/office/infopath/2007/PartnerControls"/>
+    <ds:schemaRef ds:uri="http://schemas.microsoft.com/sharepoint/v3"/>
+    <ds:schemaRef ds:uri="7755e09e-18d1-493a-950e-5a615bcdbc52"/>
+    <ds:schemaRef ds:uri="9c3aca8e-802d-4afe-8de2-403351c573ee"/>
+  </ds:schemaRefs>
+</ds:datastoreItem>
+</file>
+
 <file path=docMetadata/LabelInfo.xml><?xml version="1.0" encoding="utf-8"?>
 <clbl:labelList xmlns:clbl="http://schemas.microsoft.com/office/2020/mipLabelMetadata">
   <clbl:label id="{ccc8e57c-9090-4edc-b15c-adfa9d38f666}" enabled="1" method="Privileged" siteId="{e7290980-632a-4f65-bbb2-1151420d7c39}" contentBits="0" removed="0"/>

</xml_diff>